<commit_message>
added more hotkeys and plugins documentation
</commit_message>
<xml_diff>
--- a/directoare/dir.docx
+++ b/directoare/dir.docx
@@ -23,6 +23,19 @@
       </w:pPr>
       <w:r>
         <w:rPr>
+          <w:rFonts w:asciiTheme="majorHAnsi" w:hAnsiTheme="majorHAnsi"/>
+        </w:rPr>
+        <w:t>-In asta adaug setarile specifice nVim (ide-ului)</w:t>
+      </w:r>
+    </w:p>
+    <w:p>
+      <w:pPr>
+        <w:rPr>
+          <w:rFonts w:asciiTheme="majorHAnsi" w:hAnsiTheme="majorHAnsi"/>
+        </w:rPr>
+      </w:pPr>
+      <w:r>
+        <w:rPr>
           <w:rFonts w:ascii="Aptos Black" w:hAnsi="Aptos Black"/>
         </w:rPr>
         <w:tab/>
@@ -81,11 +94,31 @@
           <w:rFonts w:ascii="Aptos Black" w:hAnsi="Aptos Black"/>
         </w:rPr>
       </w:pPr>
+    </w:p>
+    <w:p>
+      <w:pPr>
+        <w:rPr>
+          <w:rFonts w:ascii="Aptos Black" w:hAnsi="Aptos Black"/>
+        </w:rPr>
+      </w:pPr>
       <w:r>
         <w:rPr>
           <w:rFonts w:ascii="Aptos Black" w:hAnsi="Aptos Black"/>
         </w:rPr>
         <w:t>In “nvim/after/plugin”</w:t>
+      </w:r>
+    </w:p>
+    <w:p>
+      <w:pPr>
+        <w:rPr>
+          <w:rFonts w:asciiTheme="majorHAnsi" w:hAnsiTheme="majorHAnsi"/>
+        </w:rPr>
+      </w:pPr>
+      <w:r>
+        <w:rPr>
+          <w:rFonts w:asciiTheme="majorHAnsi" w:hAnsiTheme="majorHAnsi"/>
+        </w:rPr>
+        <w:t>-In asta adaug setarile/maparile specifice pluginurilor</w:t>
       </w:r>
     </w:p>
     <w:p>

</xml_diff>